<commit_message>
Lab 1 handout: report due Tuesday, Oct 13
Co-Authored-By: Claude Opus 5.5 <noreply@anthropic.com>
Claude-Session: https://claude.ai/code/session_01L5wtdFQ56tSrjgsPVTkoXa
</commit_message>
<xml_diff>
--- a/docs/downloads/DATA405_Lab1_Handout.docx
+++ b/docs/downloads/DATA405_Lab1_Handout.docx
@@ -164,7 +164,7 @@
           <w:sz w:val="21"/>
           <w:szCs w:val="21"/>
         </w:rPr>
-        <w:t xml:space="preserve">Write your answers to Q1–Q7 on this handout or in your lab report. Report due Sunday on Canvas (one page is enough).</w:t>
+        <w:t xml:space="preserve">Write your answers to Q1–Q7 on this handout or in your lab report. Report due Tuesday, Oct 13 on Canvas (one page is enough).</w:t>
       </w:r>
     </w:p>
     <w:p>
@@ -5713,7 +5713,7 @@
           <w:sz w:val="28"/>
           <w:szCs w:val="28"/>
         </w:rPr>
-        <w:t xml:space="preserve">Lab report (due Sunday)</w:t>
+        <w:t xml:space="preserve">Lab report (due Tuesday, Oct 13)</w:t>
       </w:r>
     </w:p>
     <w:p>

</xml_diff>